<commit_message>
volledige veranderinge gemaak en fase 3 is gedoen
</commit_message>
<xml_diff>
--- a/dokumentasie/Dokumentasie oor die webblad.docx
+++ b/dokumentasie/Dokumentasie oor die webblad.docx
@@ -145,7 +145,13 @@
       </w:r>
       <w:proofErr w:type="spellEnd"/>
       <w:r>
-        <w:t xml:space="preserve"> (Fase 2)</w:t>
+        <w:t xml:space="preserve"> (Fase </w:t>
+      </w:r>
+      <w:r>
+        <w:t>3</w:t>
+      </w:r>
+      <w:r>
+        <w:t>)</w:t>
       </w:r>
     </w:p>
     <w:p>
@@ -4691,7 +4697,30 @@
           <w:b/>
           <w:bCs/>
         </w:rPr>
-        <w:t>, Kontak).</w:t>
+        <w:t>, Kontak</w:t>
+      </w:r>
+      <w:r>
+        <w:rPr>
+          <w:b/>
+          <w:bCs/>
+        </w:rPr>
+        <w:t xml:space="preserve">, </w:t>
+      </w:r>
+      <w:proofErr w:type="spellStart"/>
+      <w:r>
+        <w:rPr>
+          <w:b/>
+          <w:bCs/>
+        </w:rPr>
+        <w:t>Mandjie</w:t>
+      </w:r>
+      <w:proofErr w:type="spellEnd"/>
+      <w:r>
+        <w:rPr>
+          <w:b/>
+          <w:bCs/>
+        </w:rPr>
+        <w:t>).</w:t>
       </w:r>
     </w:p>
     <w:p>
@@ -5792,6 +5821,254 @@
     </w:p>
     <w:p>
       <w:pPr>
+        <w:numPr>
+          <w:ilvl w:val="0"/>
+          <w:numId w:val="16"/>
+        </w:numPr>
+        <w:rPr>
+          <w:b/>
+          <w:bCs/>
+        </w:rPr>
+      </w:pPr>
+      <w:proofErr w:type="spellStart"/>
+      <w:r>
+        <w:rPr>
+          <w:b/>
+          <w:bCs/>
+        </w:rPr>
+        <w:t>Tabelle</w:t>
+      </w:r>
+      <w:proofErr w:type="spellEnd"/>
+      <w:r>
+        <w:rPr>
+          <w:b/>
+          <w:bCs/>
+        </w:rPr>
+        <w:t xml:space="preserve">: Hierdie </w:t>
+      </w:r>
+      <w:proofErr w:type="spellStart"/>
+      <w:r>
+        <w:rPr>
+          <w:b/>
+          <w:bCs/>
+        </w:rPr>
+        <w:t>tabel</w:t>
+      </w:r>
+      <w:proofErr w:type="spellEnd"/>
+      <w:r>
+        <w:rPr>
+          <w:b/>
+          <w:bCs/>
+        </w:rPr>
+        <w:t xml:space="preserve"> word Gebruik om die </w:t>
+      </w:r>
+      <w:proofErr w:type="spellStart"/>
+      <w:r>
+        <w:rPr>
+          <w:b/>
+          <w:bCs/>
+        </w:rPr>
+        <w:t>kostes</w:t>
+      </w:r>
+      <w:proofErr w:type="spellEnd"/>
+      <w:r>
+        <w:rPr>
+          <w:b/>
+          <w:bCs/>
+        </w:rPr>
+        <w:t xml:space="preserve"> van die </w:t>
+      </w:r>
+      <w:proofErr w:type="spellStart"/>
+      <w:r>
+        <w:rPr>
+          <w:b/>
+          <w:bCs/>
+        </w:rPr>
+        <w:t>produkte</w:t>
+      </w:r>
+      <w:proofErr w:type="spellEnd"/>
+      <w:r>
+        <w:rPr>
+          <w:b/>
+          <w:bCs/>
+        </w:rPr>
+        <w:t xml:space="preserve"> te wys en die </w:t>
+      </w:r>
+      <w:proofErr w:type="spellStart"/>
+      <w:r>
+        <w:rPr>
+          <w:b/>
+          <w:bCs/>
+        </w:rPr>
+        <w:t>voorraad</w:t>
+      </w:r>
+      <w:proofErr w:type="spellEnd"/>
+      <w:r>
+        <w:rPr>
+          <w:b/>
+          <w:bCs/>
+        </w:rPr>
+        <w:t xml:space="preserve"> wat </w:t>
+      </w:r>
+      <w:proofErr w:type="spellStart"/>
+      <w:r>
+        <w:rPr>
+          <w:b/>
+          <w:bCs/>
+        </w:rPr>
+        <w:t>beskikbaar</w:t>
+      </w:r>
+      <w:proofErr w:type="spellEnd"/>
+      <w:r>
+        <w:rPr>
+          <w:b/>
+          <w:bCs/>
+        </w:rPr>
+        <w:t xml:space="preserve"> is te </w:t>
+      </w:r>
+      <w:proofErr w:type="spellStart"/>
+      <w:r>
+        <w:rPr>
+          <w:b/>
+          <w:bCs/>
+        </w:rPr>
+        <w:t>vertoon</w:t>
+      </w:r>
+      <w:proofErr w:type="spellEnd"/>
+      <w:r>
+        <w:rPr>
+          <w:b/>
+          <w:bCs/>
+        </w:rPr>
+        <w:t>.</w:t>
+      </w:r>
+    </w:p>
+    <w:p>
+      <w:pPr>
+        <w:numPr>
+          <w:ilvl w:val="0"/>
+          <w:numId w:val="16"/>
+        </w:numPr>
+        <w:rPr>
+          <w:b/>
+          <w:bCs/>
+        </w:rPr>
+      </w:pPr>
+      <w:proofErr w:type="spellStart"/>
+      <w:r>
+        <w:rPr>
+          <w:b/>
+          <w:bCs/>
+        </w:rPr>
+        <w:t>Bestelvorm</w:t>
+      </w:r>
+      <w:proofErr w:type="spellEnd"/>
+      <w:r>
+        <w:rPr>
+          <w:b/>
+          <w:bCs/>
+        </w:rPr>
+        <w:t xml:space="preserve">: Hierdie </w:t>
+      </w:r>
+      <w:proofErr w:type="spellStart"/>
+      <w:r>
+        <w:rPr>
+          <w:b/>
+          <w:bCs/>
+        </w:rPr>
+        <w:t>vorm</w:t>
+      </w:r>
+      <w:proofErr w:type="spellEnd"/>
+      <w:r>
+        <w:rPr>
+          <w:b/>
+          <w:bCs/>
+        </w:rPr>
+        <w:t xml:space="preserve"> is vir die </w:t>
+      </w:r>
+      <w:proofErr w:type="spellStart"/>
+      <w:r>
+        <w:rPr>
+          <w:b/>
+          <w:bCs/>
+        </w:rPr>
+        <w:t>gebruiker</w:t>
+      </w:r>
+      <w:proofErr w:type="spellEnd"/>
+      <w:r>
+        <w:rPr>
+          <w:b/>
+          <w:bCs/>
+        </w:rPr>
+        <w:t xml:space="preserve"> om </w:t>
+      </w:r>
+      <w:proofErr w:type="spellStart"/>
+      <w:r>
+        <w:rPr>
+          <w:b/>
+          <w:bCs/>
+        </w:rPr>
+        <w:t>hulle</w:t>
+      </w:r>
+      <w:proofErr w:type="spellEnd"/>
+      <w:r>
+        <w:rPr>
+          <w:b/>
+          <w:bCs/>
+        </w:rPr>
+        <w:t xml:space="preserve"> inligting in te </w:t>
+      </w:r>
+      <w:proofErr w:type="spellStart"/>
+      <w:r>
+        <w:rPr>
+          <w:b/>
+          <w:bCs/>
+        </w:rPr>
+        <w:t>voer</w:t>
+      </w:r>
+      <w:proofErr w:type="spellEnd"/>
+      <w:r>
+        <w:rPr>
+          <w:b/>
+          <w:bCs/>
+        </w:rPr>
+        <w:t xml:space="preserve"> om die </w:t>
+      </w:r>
+      <w:proofErr w:type="spellStart"/>
+      <w:r>
+        <w:rPr>
+          <w:b/>
+          <w:bCs/>
+        </w:rPr>
+        <w:t>bestelling</w:t>
+      </w:r>
+      <w:proofErr w:type="spellEnd"/>
+      <w:r>
+        <w:rPr>
+          <w:b/>
+          <w:bCs/>
+        </w:rPr>
+        <w:t xml:space="preserve"> van die </w:t>
+      </w:r>
+      <w:proofErr w:type="spellStart"/>
+      <w:r>
+        <w:rPr>
+          <w:b/>
+          <w:bCs/>
+        </w:rPr>
+        <w:t>produkte</w:t>
+      </w:r>
+      <w:proofErr w:type="spellEnd"/>
+      <w:r>
+        <w:rPr>
+          <w:b/>
+          <w:bCs/>
+        </w:rPr>
+        <w:t xml:space="preserve"> te maak.</w:t>
+      </w:r>
+    </w:p>
+    <w:p>
+      <w:pPr>
         <w:rPr>
           <w:b/>
           <w:bCs/>
@@ -6442,6 +6719,7 @@
           <w:b/>
           <w:bCs/>
         </w:rPr>
+        <w:lastRenderedPageBreak/>
         <w:t xml:space="preserve">7. </w:t>
       </w:r>
       <w:proofErr w:type="spellStart"/>
@@ -6833,7 +7111,6 @@
           <w:b/>
           <w:bCs/>
         </w:rPr>
-        <w:lastRenderedPageBreak/>
         <w:t xml:space="preserve">Deur hierdie </w:t>
       </w:r>
       <w:proofErr w:type="spellStart"/>
@@ -7154,7 +7431,7 @@
           <w:bCs/>
         </w:rPr>
         <w:pict w14:anchorId="7EE3AFF2">
-          <v:rect id="_x0000_i1058" style="width:0;height:1.5pt" o:hralign="center" o:hrstd="t" o:hrnoshade="t" o:hr="t" fillcolor="gray" stroked="f"/>
+          <v:rect id="_x0000_i1025" style="width:0;height:1.5pt" o:hralign="center" o:hrstd="t" o:hrnoshade="t" o:hr="t" fillcolor="gray" stroked="f"/>
         </w:pict>
       </w:r>
     </w:p>
@@ -7763,7 +8040,7 @@
           <w:bCs/>
         </w:rPr>
         <w:pict w14:anchorId="2ECECAC3">
-          <v:rect id="_x0000_i1038" style="width:0;height:1.5pt" o:hralign="center" o:hrstd="t" o:hrnoshade="t" o:hr="t" fillcolor="gray" stroked="f"/>
+          <v:rect id="_x0000_i1026" style="width:0;height:1.5pt" o:hralign="center" o:hrstd="t" o:hrnoshade="t" o:hr="t" fillcolor="gray" stroked="f"/>
         </w:pict>
       </w:r>
     </w:p>
@@ -7976,14 +8253,30 @@
       <w:pPr>
         <w:pStyle w:val="Subtitle"/>
       </w:pPr>
-      <w:r>
-        <w:t xml:space="preserve">Oor </w:t>
-      </w:r>
-      <w:proofErr w:type="spellStart"/>
-      <w:r>
-        <w:t>ons</w:t>
-      </w:r>
-      <w:proofErr w:type="spellEnd"/>
+    </w:p>
+    <w:p>
+      <w:pPr>
+        <w:pStyle w:val="Subtitle"/>
+      </w:pPr>
+    </w:p>
+    <w:p>
+      <w:pPr>
+        <w:pStyle w:val="Subtitle"/>
+      </w:pPr>
+    </w:p>
+    <w:p>
+      <w:pPr>
+        <w:pStyle w:val="Subtitle"/>
+      </w:pPr>
+    </w:p>
+    <w:p>
+      <w:pPr>
+        <w:pStyle w:val="Subtitle"/>
+      </w:pPr>
+      <w:r>
+        <w:lastRenderedPageBreak/>
+        <w:t>Oor ons</w:t>
+      </w:r>
     </w:p>
     <w:p>
       <w:r>
@@ -8103,7 +8396,43 @@
       <w:pPr>
         <w:pStyle w:val="Subtitle"/>
       </w:pPr>
-      <w:r>
+    </w:p>
+    <w:p>
+      <w:pPr>
+        <w:pStyle w:val="Subtitle"/>
+      </w:pPr>
+    </w:p>
+    <w:p>
+      <w:pPr>
+        <w:pStyle w:val="Subtitle"/>
+      </w:pPr>
+    </w:p>
+    <w:p>
+      <w:pPr>
+        <w:pStyle w:val="Subtitle"/>
+      </w:pPr>
+    </w:p>
+    <w:p>
+      <w:pPr>
+        <w:pStyle w:val="Subtitle"/>
+      </w:pPr>
+    </w:p>
+    <w:p>
+      <w:pPr>
+        <w:pStyle w:val="Subtitle"/>
+      </w:pPr>
+    </w:p>
+    <w:p>
+      <w:pPr>
+        <w:pStyle w:val="Subtitle"/>
+      </w:pPr>
+    </w:p>
+    <w:p>
+      <w:pPr>
+        <w:pStyle w:val="Subtitle"/>
+      </w:pPr>
+      <w:r>
+        <w:lastRenderedPageBreak/>
         <w:t>Kontak</w:t>
       </w:r>
     </w:p>
@@ -8237,8 +8566,49 @@
       <w:pPr>
         <w:pStyle w:val="Subtitle"/>
       </w:pPr>
-      <w:proofErr w:type="spellStart"/>
-      <w:r>
+    </w:p>
+    <w:p>
+      <w:pPr>
+        <w:pStyle w:val="Subtitle"/>
+      </w:pPr>
+    </w:p>
+    <w:p>
+      <w:pPr>
+        <w:pStyle w:val="Subtitle"/>
+      </w:pPr>
+    </w:p>
+    <w:p>
+      <w:pPr>
+        <w:pStyle w:val="Subtitle"/>
+      </w:pPr>
+    </w:p>
+    <w:p>
+      <w:pPr>
+        <w:pStyle w:val="Subtitle"/>
+      </w:pPr>
+    </w:p>
+    <w:p>
+      <w:pPr>
+        <w:pStyle w:val="Subtitle"/>
+      </w:pPr>
+    </w:p>
+    <w:p>
+      <w:pPr>
+        <w:pStyle w:val="Subtitle"/>
+      </w:pPr>
+    </w:p>
+    <w:p>
+      <w:pPr>
+        <w:pStyle w:val="Subtitle"/>
+      </w:pPr>
+    </w:p>
+    <w:p>
+      <w:pPr>
+        <w:pStyle w:val="Subtitle"/>
+      </w:pPr>
+      <w:proofErr w:type="spellStart"/>
+      <w:r>
+        <w:lastRenderedPageBreak/>
         <w:t>Tuisblad</w:t>
       </w:r>
       <w:proofErr w:type="spellEnd"/>
@@ -8298,14 +8668,14 @@
       <w:pPr>
         <w:pStyle w:val="Subtitle"/>
       </w:pPr>
-      <w:r>
-        <w:t xml:space="preserve">Oor </w:t>
-      </w:r>
-      <w:proofErr w:type="spellStart"/>
-      <w:r>
-        <w:t>ons</w:t>
-      </w:r>
-      <w:proofErr w:type="spellEnd"/>
+    </w:p>
+    <w:p>
+      <w:pPr>
+        <w:pStyle w:val="Subtitle"/>
+      </w:pPr>
+      <w:r>
+        <w:t>Oor ons</w:t>
+      </w:r>
     </w:p>
     <w:p>
       <w:r>
@@ -8363,6 +8733,11 @@
       <w:pPr>
         <w:pStyle w:val="Subtitle"/>
       </w:pPr>
+    </w:p>
+    <w:p>
+      <w:pPr>
+        <w:pStyle w:val="Subtitle"/>
+      </w:pPr>
       <w:proofErr w:type="spellStart"/>
       <w:r>
         <w:t>Produkte</w:t>
@@ -8468,6 +8843,685 @@
             </a:graphic>
           </wp:inline>
         </w:drawing>
+      </w:r>
+    </w:p>
+    <w:p/>
+    <w:p/>
+    <w:p/>
+    <w:p/>
+    <w:p/>
+    <w:p/>
+    <w:p/>
+    <w:p/>
+    <w:p/>
+    <w:p>
+      <w:pPr>
+        <w:rPr>
+          <w:sz w:val="24"/>
+          <w:szCs w:val="24"/>
+        </w:rPr>
+      </w:pPr>
+    </w:p>
+    <w:p>
+      <w:pPr>
+        <w:rPr>
+          <w:sz w:val="24"/>
+          <w:szCs w:val="24"/>
+        </w:rPr>
+      </w:pPr>
+    </w:p>
+    <w:p>
+      <w:pPr>
+        <w:rPr>
+          <w:sz w:val="24"/>
+          <w:szCs w:val="24"/>
+        </w:rPr>
+      </w:pPr>
+    </w:p>
+    <w:p>
+      <w:r>
+        <w:rPr>
+          <w:sz w:val="24"/>
+          <w:szCs w:val="24"/>
+        </w:rPr>
+        <w:t xml:space="preserve">Verder ‘n </w:t>
+      </w:r>
+      <w:proofErr w:type="spellStart"/>
+      <w:r>
+        <w:rPr>
+          <w:sz w:val="24"/>
+          <w:szCs w:val="24"/>
+        </w:rPr>
+        <w:t>geopdateerde</w:t>
+      </w:r>
+      <w:proofErr w:type="spellEnd"/>
+      <w:r>
+        <w:rPr>
+          <w:sz w:val="24"/>
+          <w:szCs w:val="24"/>
+        </w:rPr>
+        <w:t xml:space="preserve"> </w:t>
+      </w:r>
+      <w:proofErr w:type="spellStart"/>
+      <w:r>
+        <w:rPr>
+          <w:sz w:val="24"/>
+          <w:szCs w:val="24"/>
+        </w:rPr>
+        <w:t>weergawe</w:t>
+      </w:r>
+      <w:proofErr w:type="spellEnd"/>
+      <w:r>
+        <w:rPr>
+          <w:sz w:val="24"/>
+          <w:szCs w:val="24"/>
+        </w:rPr>
+        <w:t xml:space="preserve"> vir </w:t>
+      </w:r>
+      <w:proofErr w:type="spellStart"/>
+      <w:r>
+        <w:rPr>
+          <w:sz w:val="24"/>
+          <w:szCs w:val="24"/>
+        </w:rPr>
+        <w:t>fase</w:t>
+      </w:r>
+      <w:proofErr w:type="spellEnd"/>
+      <w:r>
+        <w:rPr>
+          <w:sz w:val="24"/>
+          <w:szCs w:val="24"/>
+        </w:rPr>
+        <w:t xml:space="preserve"> 3 is </w:t>
+      </w:r>
+      <w:proofErr w:type="spellStart"/>
+      <w:r>
+        <w:rPr>
+          <w:sz w:val="24"/>
+          <w:szCs w:val="24"/>
+        </w:rPr>
+        <w:t>geskep</w:t>
+      </w:r>
+      <w:proofErr w:type="spellEnd"/>
+      <w:r>
+        <w:rPr>
+          <w:sz w:val="24"/>
+          <w:szCs w:val="24"/>
+        </w:rPr>
+        <w:t xml:space="preserve"> en </w:t>
+      </w:r>
+      <w:proofErr w:type="spellStart"/>
+      <w:r>
+        <w:rPr>
+          <w:sz w:val="24"/>
+          <w:szCs w:val="24"/>
+        </w:rPr>
+        <w:t>hier</w:t>
+      </w:r>
+      <w:proofErr w:type="spellEnd"/>
+      <w:r>
+        <w:rPr>
+          <w:sz w:val="24"/>
+          <w:szCs w:val="24"/>
+        </w:rPr>
+        <w:t xml:space="preserve"> is die </w:t>
+      </w:r>
+      <w:proofErr w:type="spellStart"/>
+      <w:r>
+        <w:rPr>
+          <w:sz w:val="24"/>
+          <w:szCs w:val="24"/>
+        </w:rPr>
+        <w:t>volgende</w:t>
+      </w:r>
+      <w:proofErr w:type="spellEnd"/>
+      <w:r>
+        <w:rPr>
+          <w:sz w:val="24"/>
+          <w:szCs w:val="24"/>
+        </w:rPr>
+        <w:t xml:space="preserve"> </w:t>
+      </w:r>
+      <w:proofErr w:type="spellStart"/>
+      <w:r>
+        <w:rPr>
+          <w:sz w:val="24"/>
+          <w:szCs w:val="24"/>
+        </w:rPr>
+        <w:t>opgedateerde</w:t>
+      </w:r>
+      <w:proofErr w:type="spellEnd"/>
+      <w:r>
+        <w:rPr>
+          <w:sz w:val="24"/>
+          <w:szCs w:val="24"/>
+        </w:rPr>
+        <w:t xml:space="preserve"> inligting</w:t>
+      </w:r>
+      <w:r>
+        <w:t>:</w:t>
+      </w:r>
+      <w:r>
+        <w:br/>
+      </w:r>
+      <w:r>
+        <w:br/>
+      </w:r>
+      <w:r>
+        <w:rPr>
+          <w:noProof/>
+        </w:rPr>
+        <w:drawing>
+          <wp:inline distT="0" distB="0" distL="0" distR="0" wp14:anchorId="07C748FB" wp14:editId="3AF1F62D">
+            <wp:extent cx="5731510" cy="5653405"/>
+            <wp:effectExtent l="0" t="0" r="2540" b="4445"/>
+            <wp:docPr id="586080920" name="Picture 1"/>
+            <wp:cNvGraphicFramePr>
+              <a:graphicFrameLocks xmlns:a="http://schemas.openxmlformats.org/drawingml/2006/main" noChangeAspect="1"/>
+            </wp:cNvGraphicFramePr>
+            <a:graphic xmlns:a="http://schemas.openxmlformats.org/drawingml/2006/main">
+              <a:graphicData uri="http://schemas.openxmlformats.org/drawingml/2006/picture">
+                <pic:pic xmlns:pic="http://schemas.openxmlformats.org/drawingml/2006/picture">
+                  <pic:nvPicPr>
+                    <pic:cNvPr id="586080920" name=""/>
+                    <pic:cNvPicPr/>
+                  </pic:nvPicPr>
+                  <pic:blipFill>
+                    <a:blip r:embed="rId13"/>
+                    <a:stretch>
+                      <a:fillRect/>
+                    </a:stretch>
+                  </pic:blipFill>
+                  <pic:spPr>
+                    <a:xfrm>
+                      <a:off x="0" y="0"/>
+                      <a:ext cx="5731510" cy="5653405"/>
+                    </a:xfrm>
+                    <a:prstGeom prst="rect">
+                      <a:avLst/>
+                    </a:prstGeom>
+                  </pic:spPr>
+                </pic:pic>
+              </a:graphicData>
+            </a:graphic>
+          </wp:inline>
+        </w:drawing>
+      </w:r>
+    </w:p>
+    <w:p>
+      <w:r>
+        <w:t xml:space="preserve">‘n Nuwe </w:t>
+      </w:r>
+      <w:proofErr w:type="spellStart"/>
+      <w:r>
+        <w:t>vorms</w:t>
+      </w:r>
+      <w:proofErr w:type="spellEnd"/>
+      <w:r>
+        <w:t xml:space="preserve"> is </w:t>
+      </w:r>
+      <w:proofErr w:type="spellStart"/>
+      <w:r>
+        <w:t>bygesit</w:t>
+      </w:r>
+      <w:proofErr w:type="spellEnd"/>
+      <w:r>
+        <w:t xml:space="preserve"> in die </w:t>
+      </w:r>
+      <w:proofErr w:type="spellStart"/>
+      <w:r>
+        <w:t>produkte</w:t>
+      </w:r>
+      <w:proofErr w:type="spellEnd"/>
+      <w:r>
+        <w:t xml:space="preserve"> </w:t>
+      </w:r>
+      <w:proofErr w:type="spellStart"/>
+      <w:r>
+        <w:t>bladsy</w:t>
+      </w:r>
+      <w:proofErr w:type="spellEnd"/>
+      <w:r>
+        <w:t xml:space="preserve"> heel </w:t>
+      </w:r>
+      <w:proofErr w:type="spellStart"/>
+      <w:r>
+        <w:t>onder</w:t>
+      </w:r>
+      <w:proofErr w:type="spellEnd"/>
+      <w:r>
+        <w:t xml:space="preserve"> om die </w:t>
+      </w:r>
+      <w:proofErr w:type="spellStart"/>
+      <w:r>
+        <w:t>bestellings</w:t>
+      </w:r>
+      <w:proofErr w:type="spellEnd"/>
+      <w:r>
+        <w:t xml:space="preserve"> vir die </w:t>
+      </w:r>
+      <w:proofErr w:type="spellStart"/>
+      <w:r>
+        <w:t>produkte</w:t>
+      </w:r>
+      <w:proofErr w:type="spellEnd"/>
+      <w:r>
+        <w:t xml:space="preserve"> te </w:t>
+      </w:r>
+      <w:proofErr w:type="spellStart"/>
+      <w:r>
+        <w:t>kan</w:t>
+      </w:r>
+      <w:proofErr w:type="spellEnd"/>
+      <w:r>
+        <w:t xml:space="preserve"> maak. </w:t>
+      </w:r>
+    </w:p>
+    <w:p>
+      <w:r>
+        <w:t xml:space="preserve">Die </w:t>
+      </w:r>
+      <w:proofErr w:type="spellStart"/>
+      <w:r>
+        <w:t>veranderinge</w:t>
+      </w:r>
+      <w:proofErr w:type="spellEnd"/>
+      <w:r>
+        <w:t xml:space="preserve"> wat </w:t>
+      </w:r>
+      <w:proofErr w:type="spellStart"/>
+      <w:r>
+        <w:t>plaasgevind</w:t>
+      </w:r>
+      <w:proofErr w:type="spellEnd"/>
+      <w:r>
+        <w:t xml:space="preserve"> het was </w:t>
+      </w:r>
+      <w:proofErr w:type="spellStart"/>
+      <w:r>
+        <w:t>dat</w:t>
+      </w:r>
+      <w:proofErr w:type="spellEnd"/>
+      <w:r>
+        <w:t xml:space="preserve"> die 2 </w:t>
+      </w:r>
+      <w:proofErr w:type="spellStart"/>
+      <w:r>
+        <w:t>panele</w:t>
+      </w:r>
+      <w:proofErr w:type="spellEnd"/>
+      <w:r>
+        <w:t xml:space="preserve"> </w:t>
+      </w:r>
+      <w:proofErr w:type="spellStart"/>
+      <w:r>
+        <w:t>onder</w:t>
+      </w:r>
+      <w:proofErr w:type="spellEnd"/>
+      <w:r>
+        <w:t xml:space="preserve"> die </w:t>
+      </w:r>
+      <w:proofErr w:type="spellStart"/>
+      <w:r>
+        <w:t>produkte</w:t>
+      </w:r>
+      <w:proofErr w:type="spellEnd"/>
+      <w:r>
+        <w:t xml:space="preserve"> </w:t>
+      </w:r>
+      <w:proofErr w:type="spellStart"/>
+      <w:r>
+        <w:t>bladsy</w:t>
+      </w:r>
+      <w:proofErr w:type="spellEnd"/>
+      <w:r>
+        <w:t xml:space="preserve"> </w:t>
+      </w:r>
+      <w:proofErr w:type="spellStart"/>
+      <w:r>
+        <w:t>verwyder</w:t>
+      </w:r>
+      <w:proofErr w:type="spellEnd"/>
+      <w:r>
+        <w:t xml:space="preserve"> was en </w:t>
+      </w:r>
+      <w:proofErr w:type="spellStart"/>
+      <w:r>
+        <w:t>vervang</w:t>
+      </w:r>
+      <w:proofErr w:type="spellEnd"/>
+      <w:r>
+        <w:t xml:space="preserve"> was met die </w:t>
+      </w:r>
+      <w:proofErr w:type="spellStart"/>
+      <w:r>
+        <w:t>bestelvorm</w:t>
+      </w:r>
+      <w:proofErr w:type="spellEnd"/>
+      <w:r>
+        <w:t xml:space="preserve">. Sien die </w:t>
+      </w:r>
+      <w:proofErr w:type="spellStart"/>
+      <w:r>
+        <w:t>kode</w:t>
+      </w:r>
+      <w:proofErr w:type="spellEnd"/>
+      <w:r>
+        <w:t xml:space="preserve"> om te kyk </w:t>
+      </w:r>
+      <w:proofErr w:type="spellStart"/>
+      <w:r>
+        <w:t>na</w:t>
+      </w:r>
+      <w:proofErr w:type="spellEnd"/>
+      <w:r>
+        <w:t xml:space="preserve"> </w:t>
+      </w:r>
+      <w:proofErr w:type="spellStart"/>
+      <w:r>
+        <w:t>watter</w:t>
+      </w:r>
+      <w:proofErr w:type="spellEnd"/>
+      <w:r>
+        <w:t xml:space="preserve"> </w:t>
+      </w:r>
+      <w:proofErr w:type="spellStart"/>
+      <w:r>
+        <w:t>panele</w:t>
+      </w:r>
+      <w:proofErr w:type="spellEnd"/>
+      <w:r>
+        <w:t xml:space="preserve"> met die inligting en </w:t>
+      </w:r>
+      <w:proofErr w:type="spellStart"/>
+      <w:r>
+        <w:t>knoppies</w:t>
+      </w:r>
+      <w:proofErr w:type="spellEnd"/>
+      <w:r>
+        <w:t xml:space="preserve"> </w:t>
+      </w:r>
+      <w:proofErr w:type="spellStart"/>
+      <w:r>
+        <w:t>verwyder</w:t>
+      </w:r>
+      <w:proofErr w:type="spellEnd"/>
+      <w:r>
+        <w:t xml:space="preserve"> is.</w:t>
+      </w:r>
+    </w:p>
+    <w:p>
+      <w:r>
+        <w:rPr>
+          <w:noProof/>
+        </w:rPr>
+        <w:lastRenderedPageBreak/>
+        <w:drawing>
+          <wp:inline distT="0" distB="0" distL="0" distR="0" wp14:anchorId="6CBDDA3D" wp14:editId="1BD28927">
+            <wp:extent cx="5731510" cy="1662430"/>
+            <wp:effectExtent l="0" t="0" r="2540" b="0"/>
+            <wp:docPr id="1989849774" name="Picture 1"/>
+            <wp:cNvGraphicFramePr>
+              <a:graphicFrameLocks xmlns:a="http://schemas.openxmlformats.org/drawingml/2006/main" noChangeAspect="1"/>
+            </wp:cNvGraphicFramePr>
+            <a:graphic xmlns:a="http://schemas.openxmlformats.org/drawingml/2006/main">
+              <a:graphicData uri="http://schemas.openxmlformats.org/drawingml/2006/picture">
+                <pic:pic xmlns:pic="http://schemas.openxmlformats.org/drawingml/2006/picture">
+                  <pic:nvPicPr>
+                    <pic:cNvPr id="1989849774" name=""/>
+                    <pic:cNvPicPr/>
+                  </pic:nvPicPr>
+                  <pic:blipFill>
+                    <a:blip r:embed="rId14"/>
+                    <a:stretch>
+                      <a:fillRect/>
+                    </a:stretch>
+                  </pic:blipFill>
+                  <pic:spPr>
+                    <a:xfrm>
+                      <a:off x="0" y="0"/>
+                      <a:ext cx="5731510" cy="1662430"/>
+                    </a:xfrm>
+                    <a:prstGeom prst="rect">
+                      <a:avLst/>
+                    </a:prstGeom>
+                  </pic:spPr>
+                </pic:pic>
+              </a:graphicData>
+            </a:graphic>
+          </wp:inline>
+        </w:drawing>
+      </w:r>
+      <w:r>
+        <w:br/>
+      </w:r>
+      <w:r>
+        <w:br/>
+        <w:t xml:space="preserve">Die </w:t>
+      </w:r>
+      <w:proofErr w:type="spellStart"/>
+      <w:r>
+        <w:t>ander</w:t>
+      </w:r>
+      <w:proofErr w:type="spellEnd"/>
+      <w:r>
+        <w:t xml:space="preserve"> </w:t>
+      </w:r>
+      <w:proofErr w:type="spellStart"/>
+      <w:r>
+        <w:t>vorm</w:t>
+      </w:r>
+      <w:proofErr w:type="spellEnd"/>
+      <w:r>
+        <w:t xml:space="preserve"> is in die </w:t>
+      </w:r>
+      <w:proofErr w:type="spellStart"/>
+      <w:r>
+        <w:t>kontak</w:t>
+      </w:r>
+      <w:proofErr w:type="spellEnd"/>
+      <w:r>
+        <w:t xml:space="preserve"> </w:t>
+      </w:r>
+      <w:proofErr w:type="spellStart"/>
+      <w:r>
+        <w:t>bladsy</w:t>
+      </w:r>
+      <w:proofErr w:type="spellEnd"/>
+      <w:r>
+        <w:t xml:space="preserve"> waar die </w:t>
+      </w:r>
+      <w:proofErr w:type="spellStart"/>
+      <w:r>
+        <w:t>gebruiker</w:t>
+      </w:r>
+      <w:proofErr w:type="spellEnd"/>
+      <w:r>
+        <w:t xml:space="preserve"> </w:t>
+      </w:r>
+      <w:proofErr w:type="spellStart"/>
+      <w:r>
+        <w:t>hulle</w:t>
+      </w:r>
+      <w:proofErr w:type="spellEnd"/>
+      <w:r>
+        <w:t xml:space="preserve"> contact </w:t>
+      </w:r>
+      <w:proofErr w:type="spellStart"/>
+      <w:r>
+        <w:t>besonderhede</w:t>
+      </w:r>
+      <w:proofErr w:type="spellEnd"/>
+      <w:r>
+        <w:t xml:space="preserve"> </w:t>
+      </w:r>
+      <w:proofErr w:type="spellStart"/>
+      <w:r>
+        <w:t>stuur</w:t>
+      </w:r>
+      <w:proofErr w:type="spellEnd"/>
+      <w:r>
+        <w:t xml:space="preserve"> vir die </w:t>
+      </w:r>
+      <w:proofErr w:type="spellStart"/>
+      <w:r>
+        <w:t>boere</w:t>
+      </w:r>
+      <w:proofErr w:type="spellEnd"/>
+      <w:r>
+        <w:t xml:space="preserve"> om </w:t>
+      </w:r>
+      <w:proofErr w:type="spellStart"/>
+      <w:r>
+        <w:t>hulle</w:t>
+      </w:r>
+      <w:proofErr w:type="spellEnd"/>
+      <w:r>
+        <w:t xml:space="preserve"> te </w:t>
+      </w:r>
+      <w:proofErr w:type="spellStart"/>
+      <w:r>
+        <w:t>kontak</w:t>
+      </w:r>
+      <w:proofErr w:type="spellEnd"/>
+      <w:r>
+        <w:t xml:space="preserve"> en </w:t>
+      </w:r>
+      <w:proofErr w:type="spellStart"/>
+      <w:r>
+        <w:t>kommunikeer</w:t>
+      </w:r>
+      <w:proofErr w:type="spellEnd"/>
+      <w:r>
+        <w:t xml:space="preserve"> oor die </w:t>
+      </w:r>
+      <w:proofErr w:type="spellStart"/>
+      <w:r>
+        <w:t>navrae</w:t>
+      </w:r>
+      <w:proofErr w:type="spellEnd"/>
+      <w:r>
+        <w:t xml:space="preserve"> wat die </w:t>
+      </w:r>
+      <w:proofErr w:type="spellStart"/>
+      <w:r>
+        <w:t>gebruiker</w:t>
+      </w:r>
+      <w:proofErr w:type="spellEnd"/>
+      <w:r>
+        <w:t xml:space="preserve"> het.</w:t>
+      </w:r>
+    </w:p>
+    <w:p/>
+    <w:p>
+      <w:r>
+        <w:rPr>
+          <w:noProof/>
+        </w:rPr>
+        <w:drawing>
+          <wp:inline distT="0" distB="0" distL="0" distR="0" wp14:anchorId="6C91EA94" wp14:editId="606C7E23">
+            <wp:extent cx="5731510" cy="511810"/>
+            <wp:effectExtent l="0" t="0" r="2540" b="2540"/>
+            <wp:docPr id="2049532025" name="Picture 1"/>
+            <wp:cNvGraphicFramePr>
+              <a:graphicFrameLocks xmlns:a="http://schemas.openxmlformats.org/drawingml/2006/main" noChangeAspect="1"/>
+            </wp:cNvGraphicFramePr>
+            <a:graphic xmlns:a="http://schemas.openxmlformats.org/drawingml/2006/main">
+              <a:graphicData uri="http://schemas.openxmlformats.org/drawingml/2006/picture">
+                <pic:pic xmlns:pic="http://schemas.openxmlformats.org/drawingml/2006/picture">
+                  <pic:nvPicPr>
+                    <pic:cNvPr id="2049532025" name=""/>
+                    <pic:cNvPicPr/>
+                  </pic:nvPicPr>
+                  <pic:blipFill>
+                    <a:blip r:embed="rId15"/>
+                    <a:stretch>
+                      <a:fillRect/>
+                    </a:stretch>
+                  </pic:blipFill>
+                  <pic:spPr>
+                    <a:xfrm>
+                      <a:off x="0" y="0"/>
+                      <a:ext cx="5731510" cy="511810"/>
+                    </a:xfrm>
+                    <a:prstGeom prst="rect">
+                      <a:avLst/>
+                    </a:prstGeom>
+                  </pic:spPr>
+                </pic:pic>
+              </a:graphicData>
+            </a:graphic>
+          </wp:inline>
+        </w:drawing>
+      </w:r>
+    </w:p>
+    <w:p>
+      <w:r>
+        <w:t xml:space="preserve">‘n </w:t>
+      </w:r>
+      <w:proofErr w:type="spellStart"/>
+      <w:r>
+        <w:t>Mandjie</w:t>
+      </w:r>
+      <w:proofErr w:type="spellEnd"/>
+      <w:r>
+        <w:t xml:space="preserve"> is </w:t>
+      </w:r>
+      <w:proofErr w:type="spellStart"/>
+      <w:r>
+        <w:t>bygesit</w:t>
+      </w:r>
+      <w:proofErr w:type="spellEnd"/>
+      <w:r>
+        <w:t xml:space="preserve"> om dan jou </w:t>
+      </w:r>
+      <w:proofErr w:type="spellStart"/>
+      <w:r>
+        <w:t>bestellings</w:t>
+      </w:r>
+      <w:proofErr w:type="spellEnd"/>
+      <w:r>
+        <w:t xml:space="preserve"> te stoor </w:t>
+      </w:r>
+      <w:proofErr w:type="spellStart"/>
+      <w:r>
+        <w:t>voordat</w:t>
+      </w:r>
+      <w:proofErr w:type="spellEnd"/>
+      <w:r>
+        <w:t xml:space="preserve"> die finale </w:t>
+      </w:r>
+      <w:proofErr w:type="spellStart"/>
+      <w:r>
+        <w:t>bestelling</w:t>
+      </w:r>
+      <w:proofErr w:type="spellEnd"/>
+      <w:r>
+        <w:t xml:space="preserve"> </w:t>
+      </w:r>
+      <w:proofErr w:type="spellStart"/>
+      <w:r>
+        <w:t>plaasvind</w:t>
+      </w:r>
+      <w:proofErr w:type="spellEnd"/>
+      <w:r>
+        <w:t xml:space="preserve"> en die </w:t>
+      </w:r>
+      <w:proofErr w:type="spellStart"/>
+      <w:r>
+        <w:t>betaling</w:t>
+      </w:r>
+      <w:proofErr w:type="spellEnd"/>
+      <w:r>
+        <w:t xml:space="preserve"> </w:t>
+      </w:r>
+      <w:proofErr w:type="spellStart"/>
+      <w:r>
+        <w:t>gemaak</w:t>
+      </w:r>
+      <w:proofErr w:type="spellEnd"/>
+      <w:r>
+        <w:t xml:space="preserve"> word.</w:t>
       </w:r>
     </w:p>
     <w:sectPr>
@@ -11521,6 +12575,7 @@
   <w:style w:type="character" w:default="1" w:styleId="DefaultParagraphFont">
     <w:name w:val="Default Paragraph Font"/>
     <w:uiPriority w:val="1"/>
+    <w:semiHidden/>
     <w:unhideWhenUsed/>
   </w:style>
   <w:style w:type="table" w:default="1" w:styleId="TableNormal">

</xml_diff>